<commit_message>
feat(rent-agreements): add OnlyOffice Word editor with browser fallback, template fixes, and full-screen UI (16/10/2026)
</commit_message>
<xml_diff>
--- a/docs/templates/TOWER-1-804.docx
+++ b/docs/templates/TOWER-1-804.docx
@@ -1152,7 +1152,7 @@
                               <w:szCs w:val="28"/>
                               <w:u w:val="single"/>
                             </w:rPr>
-                            <w:t>{{PROPERTY_ADDRESS}}</w:t>
+                            <w:t>{PROPERTY_ADDRESS}</w:t>
                           </w:r>
                         </w:p>
                         <w:p>
@@ -1206,7 +1206,7 @@
                               <w:szCs w:val="28"/>
                               <w:u w:val="single"/>
                             </w:rPr>
-                            <w:t>{{</w:t>
+                            <w:t>{</w:t>
                           </w:r>
                           <w:r>
                             <w:rPr>
@@ -1226,7 +1226,7 @@
                               <w:szCs w:val="28"/>
                               <w:u w:val="single"/>
                             </w:rPr>
-                            <w:t>}}</w:t>
+                            <w:t>}</w:t>
                           </w:r>
                           <w:r>
                             <w:rPr>
@@ -1320,7 +1320,7 @@
                               <w:szCs w:val="28"/>
                               <w:u w:val="single"/>
                             </w:rPr>
-                            <w:t>{{</w:t>
+                            <w:t>{</w:t>
                           </w:r>
                           <w:r>
                             <w:rPr>
@@ -1338,7 +1338,7 @@
                               <w:szCs w:val="28"/>
                               <w:u w:val="single"/>
                             </w:rPr>
-                            <w:t>}}</w:t>
+                            <w:t>}</w:t>
                           </w:r>
                           <w:r>
                             <w:rPr>
@@ -1649,7 +1649,7 @@
           <w:sz w:val="22"/>
           <w:szCs w:val="22"/>
         </w:rPr>
-        <w:t>{{abbrevation}}</w:t>
+        <w:t>{abbreviation}</w:t>
       </w:r>
       <w:r>
         <w:rPr>
@@ -1667,7 +1667,7 @@
           <w:sz w:val="22"/>
           <w:szCs w:val="22"/>
         </w:rPr>
-        <w:t>{{NAME}}</w:t>
+        <w:t>{name}</w:t>
       </w:r>
       <w:r>
         <w:rPr>
@@ -1692,7 +1692,7 @@
           <w:sz w:val="22"/>
           <w:szCs w:val="22"/>
         </w:rPr>
-        <w:t>{{age}}</w:t>
+        <w:t>{age}</w:t>
       </w:r>
       <w:r>
         <w:rPr>
@@ -1732,7 +1732,7 @@
           <w:sz w:val="22"/>
           <w:szCs w:val="22"/>
         </w:rPr>
-        <w:t>{{occupation}}</w:t>
+        <w:t>{occupation}</w:t>
       </w:r>
       <w:r>
         <w:rPr>
@@ -1764,7 +1764,7 @@
           <w:sz w:val="22"/>
           <w:szCs w:val="22"/>
         </w:rPr>
-        <w:t>{{property address}}</w:t>
+        <w:t>{PROPERTY_ADDRESS}</w:t>
       </w:r>
       <w:r>
         <w:rPr>
@@ -1975,7 +1975,7 @@
           <w:sz w:val="22"/>
           <w:szCs w:val="22"/>
         </w:rPr>
-        <w:t>{{abbreviation}}</w:t>
+        <w:t>{abbreviation}</w:t>
       </w:r>
       <w:r>
         <w:rPr>
@@ -1993,7 +1993,7 @@
           <w:sz w:val="22"/>
           <w:szCs w:val="22"/>
         </w:rPr>
-        <w:t>{{NAME}}</w:t>
+        <w:t>{name}</w:t>
       </w:r>
       <w:r>
         <w:rPr>
@@ -2027,7 +2027,7 @@
           <w:sz w:val="22"/>
           <w:szCs w:val="22"/>
         </w:rPr>
-        <w:t>{{age}}</w:t>
+        <w:t>{age}</w:t>
       </w:r>
       <w:r>
         <w:rPr>
@@ -2083,7 +2083,7 @@
           <w:sz w:val="22"/>
           <w:szCs w:val="22"/>
         </w:rPr>
-        <w:t>{{occupation}}</w:t>
+        <w:t>{occupation}</w:t>
       </w:r>
       <w:r>
         <w:rPr>
@@ -2107,7 +2107,7 @@
           <w:sz w:val="22"/>
           <w:szCs w:val="22"/>
         </w:rPr>
-        <w:t>{{LICENSEE ADDRESS}}</w:t>
+        <w:t>{LICENSEE ADDRESS}</w:t>
       </w:r>
       <w:r>
         <w:rPr>
@@ -2259,7 +2259,7 @@
           <w:sz w:val="22"/>
           <w:szCs w:val="22"/>
         </w:rPr>
-        <w:t>{{abbreviation}}</w:t>
+        <w:t>{abbreviation}</w:t>
       </w:r>
       <w:r>
         <w:rPr>
@@ -2277,7 +2277,7 @@
           <w:sz w:val="22"/>
           <w:szCs w:val="22"/>
         </w:rPr>
-        <w:t>{{NAME}}</w:t>
+        <w:t>{name}</w:t>
       </w:r>
       <w:r>
         <w:rPr>
@@ -2302,7 +2302,7 @@
           <w:sz w:val="22"/>
           <w:szCs w:val="22"/>
         </w:rPr>
-        <w:t>{{age}}</w:t>
+        <w:t>{age}</w:t>
       </w:r>
       <w:r>
         <w:rPr>
@@ -2318,7 +2318,7 @@
           <w:sz w:val="22"/>
           <w:szCs w:val="22"/>
         </w:rPr>
-        <w:t>{{LICENSEE ADDRESS}}</w:t>
+        <w:t>{LICENSEE ADDRESS}</w:t>
       </w:r>
       <w:r>
         <w:rPr>
@@ -2583,7 +2583,7 @@
           <w:sz w:val="22"/>
           <w:szCs w:val="22"/>
         </w:rPr>
-        <w:t>{{PROPERTY ADDRESS}}</w:t>
+        <w:t>{PROPERTY_ADDRESS}</w:t>
       </w:r>
       <w:r>
         <w:rPr>
@@ -2648,7 +2648,7 @@
           <w:sz w:val="22"/>
           <w:szCs w:val="22"/>
         </w:rPr>
-        <w:t>{{starting date}}</w:t>
+        <w:t>{starting date}</w:t>
       </w:r>
       <w:r>
         <w:rPr>
@@ -2664,7 +2664,7 @@
           <w:sz w:val="22"/>
           <w:szCs w:val="22"/>
         </w:rPr>
-        <w:t>{{ending date}}</w:t>
+        <w:t>{ending date}</w:t>
       </w:r>
       <w:r>
         <w:rPr>
@@ -2787,7 +2787,7 @@
           <w:sz w:val="22"/>
           <w:szCs w:val="22"/>
         </w:rPr>
-        <w:t>{{rent in numbers}}</w:t>
+        <w:t>{rent in numbers}</w:t>
       </w:r>
       <w:r>
         <w:rPr>
@@ -2803,7 +2803,7 @@
           <w:sz w:val="22"/>
           <w:szCs w:val="22"/>
         </w:rPr>
-        <w:t>{{rent in words}}</w:t>
+        <w:t>{rent in words}</w:t>
       </w:r>
       <w:r>
         <w:rPr>
@@ -2911,7 +2911,7 @@
           <w:sz w:val="22"/>
           <w:szCs w:val="22"/>
         </w:rPr>
-        <w:t>{{deposit in numbers}}</w:t>
+        <w:t>{deposit in numbers}</w:t>
       </w:r>
       <w:r>
         <w:rPr>
@@ -2949,7 +2949,7 @@
           <w:sz w:val="22"/>
           <w:szCs w:val="22"/>
         </w:rPr>
-        <w:t>{{deposit in words}}</w:t>
+        <w:t>{deposit in words}</w:t>
       </w:r>
       <w:r>
         <w:rPr>
@@ -3035,7 +3035,7 @@
           <w:szCs w:val="22"/>
         </w:rPr>
         <w:lastRenderedPageBreak/>
-        <w:t>dates specified by the Respective Supplier. Property tax is {{property_tax_payer}}. Maintenance Charges is paid by {{maintenance_payer}}</w:t>
+        <w:t>dates specified by the Respective Supplier. Property tax is {property_tax_payer}. Maintenance Charges is paid by {maintenance_payer}</w:t>
       </w:r>
       <w:r>
         <w:rPr>
@@ -4283,7 +4283,7 @@
           <w:sz w:val="22"/>
           <w:szCs w:val="22"/>
         </w:rPr>
-        <w:t>{{PROPERTY ADDRESS}}</w:t>
+        <w:t>{PROPERTY_ADDRESS}</w:t>
       </w:r>
       <w:r>
         <w:rPr>
@@ -4817,7 +4817,7 @@
                 <w:sz w:val="22"/>
                 <w:szCs w:val="22"/>
               </w:rPr>
-              <w:t>{{LICENSORS NAME}}</w:t>
+              <w:t>{name}</w:t>
             </w:r>
             <w:r>
               <w:rPr>
@@ -5066,7 +5066,7 @@
                 <w:sz w:val="22"/>
                 <w:szCs w:val="22"/>
               </w:rPr>
-              <w:t>{{LICENSEE NAME}}</w:t>
+              <w:t>{name}</w:t>
             </w:r>
           </w:p>
           <w:p>
@@ -5291,7 +5291,7 @@
                 <w:sz w:val="22"/>
                 <w:szCs w:val="22"/>
               </w:rPr>
-              <w:t>{{LICENSEE NAME}}</w:t>
+              <w:t>{name}</w:t>
             </w:r>
             <w:r>
               <w:rPr>

</xml_diff>